<commit_message>
Add GitHub link to reflection 1
Co-Authored-By: Claude Opus 5.5 <noreply@anthropic.com>
</commit_message>
<xml_diff>
--- a/docs/reflection1.docx
+++ b/docs/reflection1.docx
@@ -1257,6 +1257,30 @@
         </w:rPr>
         <w:t xml:space="preserve">支援在筆記中貼上與顯示圖片，撰寫中英文使用說明，並完成 Linux 安裝檔（deb 與 AppImage）。</w:t>
       </w:r>
+    </w:p>
+    <w:p>
+      <w:pPr>
+        <w:pStyle w:val="normal1"/>
+        <w:spacing w:lineRule="auto" w:line="360" w:before="0" w:after="120"/>
+        <w:jc w:val="start"/>
+        <w:rPr/>
+      </w:pPr>
+      <w:r>
+        <w:rPr>
+          <w:rFonts w:ascii="Arial Unicode MS" w:hAnsi="Arial Unicode MS" w:cs="Arial Unicode MS" w:eastAsia="Arial Unicode MS"/>
+        </w:rPr>
+        <w:t xml:space="preserve">專案的原始碼、設計文件與每個階段的實作計畫都公開在 GitHub：</w:t>
+      </w:r>
+      <w:hyperlink r:id="rId11">
+        <w:r>
+          <w:rPr>
+            <w:rFonts w:ascii="Arial Unicode MS" w:hAnsi="Arial Unicode MS" w:cs="Arial Unicode MS" w:eastAsia="Arial Unicode MS"/>
+            <w:color w:val="1155CC"/>
+            <w:u w:val="single"/>
+          </w:rPr>
+          <w:t xml:space="preserve">https://github.com/richardlaiis/Knowmon</w:t>
+        </w:r>
+      </w:hyperlink>
     </w:p>
     <w:p>
       <w:pPr>

</xml_diff>